<commit_message>
F.040: arreglar el PDF con campos «borrados» (bug de recorte de LibreOffice)
El docx siempre estuvo bien (Word lo abre perfecto); al convertir a PDF,
LibreOffice descartaba el texto de la primera página: el content control
del nombre de la entidad + una imagen inline en el tope disparan un bug
de recorte (el original de la DGII convertido tal cual rompe igual).

- El logo va ahora en una tabla 1x1 sin bordes (las imágenes en celdas
  no disparan el bug) y el sdt del nombre quedó desenvuelto.
- corregirExtensionesDeMedia(): el módulo free guarda toda imagen como
  .png aunque sea JPEG; tras el render la media se renombra a su formato
  real y se re-apuntan relaciones y content-types.

Verificado E2E contra el Gotenberg del VPS con el logo JPG real de la
ONDP: página 1 completa. 94 tests.

Co-Authored-By: Claude Fable 5 <noreply@anthropic.com>
Claude-Session: https://claude.ai/code/session_01SY6Gin5TsCAiwckSx1BpwX
</commit_message>
<xml_diff>
--- a/plantillas/dgcp/SNCC_F040_Debida_Diligencia-tpl.docx
+++ b/plantillas/dgcp/SNCC_F040_Debida_Diligencia-tpl.docx
@@ -2,61 +2,61 @@
 <file path=word/document.xml><?xml version="1.0" encoding="utf-8"?>
 <w:document xmlns:wpc="http://schemas.microsoft.com/office/word/2010/wordprocessingCanvas" xmlns:cx="http://schemas.microsoft.com/office/drawing/2014/chartex" xmlns:cx1="http://schemas.microsoft.com/office/drawing/2015/9/8/chartex" xmlns:cx2="http://schemas.microsoft.com/office/drawing/2015/10/21/chartex" xmlns:cx3="http://schemas.microsoft.com/office/drawing/2016/5/9/chartex" xmlns:cx4="http://schemas.microsoft.com/office/drawing/2016/5/10/chartex" xmlns:cx5="http://schemas.microsoft.com/office/drawing/2016/5/11/chartex" xmlns:cx6="http://schemas.microsoft.com/office/drawing/2016/5/12/chartex" xmlns:cx7="http://schemas.microsoft.com/office/drawing/2016/5/13/chartex" xmlns:cx8="http://schemas.microsoft.com/office/drawing/2016/5/14/chartex" xmlns:mc="http://schemas.openxmlformats.org/markup-compatibility/2006" xmlns:aink="http://schemas.microsoft.com/office/drawing/2016/ink" xmlns:am3d="http://schemas.microsoft.com/office/drawing/2017/model3d" xmlns:o="urn:schemas-microsoft-com:office:office" xmlns:oel="http://schemas.microsoft.com/office/2019/extlst" xmlns:r="http://schemas.openxmlformats.org/officeDocument/2006/relationships" xmlns:m="http://schemas.openxmlformats.org/officeDocument/2006/math" xmlns:v="urn:schemas-microsoft-com:vml" xmlns:wp14="http://schemas.microsoft.com/office/word/2010/wordprocessingDrawing" xmlns:wp="http://schemas.openxmlformats.org/drawingml/2006/wordprocessingDrawing" xmlns:w10="urn:schemas-microsoft-com:office:word" xmlns:w="http://schemas.openxmlformats.org/wordprocessingml/2006/main" xmlns:w14="http://schemas.microsoft.com/office/word/2010/wordml" xmlns:w15="http://schemas.microsoft.com/office/word/2012/wordml" xmlns:w16cex="http://schemas.microsoft.com/office/word/2018/wordml/cex" xmlns:w16cid="http://schemas.microsoft.com/office/word/2016/wordml/cid" xmlns:w16="http://schemas.microsoft.com/office/word/2018/wordml" xmlns:w16du="http://schemas.microsoft.com/office/word/2023/wordml/word16du" xmlns:w16sdtdh="http://schemas.microsoft.com/office/word/2020/wordml/sdtdatahash" xmlns:w16se="http://schemas.microsoft.com/office/word/2015/wordml/symex" xmlns:wpg="http://schemas.microsoft.com/office/word/2010/wordprocessingGroup" xmlns:wpi="http://schemas.microsoft.com/office/word/2010/wordprocessingInk" xmlns:wne="http://schemas.microsoft.com/office/word/2006/wordml" xmlns:wps="http://schemas.microsoft.com/office/word/2010/wordprocessingShape" mc:Ignorable="w14 w15 w16se w16cid w16 w16cex w16sdtdh w16du wp14">
   <w:body>
-    <w:p>
-      <w:pPr>
+    <w:tbl>
+      <w:tblPr>
+        <w:tblW w:w="0" w:type="auto"/>
         <w:jc w:val="center"/>
+        <w:tblBorders>
+          <w:top w:val="none" w:sz="0" w:space="0" w:color="auto"/>
+          <w:left w:val="none" w:sz="0" w:space="0" w:color="auto"/>
+          <w:bottom w:val="none" w:sz="0" w:space="0" w:color="auto"/>
+          <w:right w:val="none" w:sz="0" w:space="0" w:color="auto"/>
+        </w:tblBorders>
+      </w:tblPr>
+      <w:tblGrid>
+        <w:gridCol w:w="1701"/>
+      </w:tblGrid>
+      <w:tr>
+        <w:tc>
+          <w:tcPr>
+            <w:tcW w:w="1701" w:type="dxa"/>
+          </w:tcPr>
+          <w:p>
+            <w:pPr>
+              <w:jc w:val="center"/>
+            </w:pPr>
+            <w:r>
+              <w:t xml:space="preserve">{%logo_institucion}</w:t>
+            </w:r>
+          </w:p>
+        </w:tc>
+      </w:tr>
+    </w:tbl>
+    <w:p/>
+    <w:p>
+      <w:pPr>
+        <w:spacing w:line="240" w:lineRule="auto"/>
+        <w:ind w:left="-142" w:firstLine="426"/>
+        <w:jc w:val="center"/>
+        <w:rPr>
+          <w:rStyle w:val="Style7"/>
+          <w:rFonts w:ascii="Book Antiqua" w:hAnsi="Book Antiqua"/>
+          <w:b w:val="0"/>
+          <w:caps w:val="0"/>
+          <w:color w:val="FF0000"/>
+          <w:sz w:val="22"/>
+          <w:szCs w:val="22"/>
+        </w:rPr>
       </w:pPr>
       <w:r>
-        <w:t xml:space="preserve">{%logo_institucion}</w:t>
+        <w:rPr>
+          <w:rFonts w:ascii="Book Antiqua" w:hAnsi="Book Antiqua"/>
+          <w:sz w:val="22"/>
+          <w:szCs w:val="22"/>
+        </w:rPr>
+        <w:t>{entidad_nombre}</w:t>
       </w:r>
     </w:p>
-    <w:sdt>
-      <w:sdtPr>
-        <w:rPr>
-          <w:rFonts w:ascii="Book Antiqua" w:hAnsi="Book Antiqua"/>
-          <w:b/>
-          <w:caps/>
-          <w:color w:val="FF0000"/>
-          <w:spacing w:val="-2"/>
-          <w:sz w:val="22"/>
-          <w:szCs w:val="22"/>
-        </w:rPr>
-        <w:alias w:val="Nombre de la institución contratante"/>
-        <w:tag w:val="Nombre de la institución contratante"/>
-        <w:id w:val="-635172558"/>
-        <w:placeholder>
-          <w:docPart w:val="C4488511676E41F7B9B42E94555F86B5"/>
-        </w:placeholder>
-        <w:text/>
-      </w:sdtPr>
-      <w:sdtEndPr/>
-      <w:sdtContent>
-        <w:p>
-          <w:pPr>
-            <w:spacing w:line="240" w:lineRule="auto"/>
-            <w:ind w:left="-142" w:firstLine="426"/>
-            <w:jc w:val="center"/>
-            <w:rPr>
-              <w:rStyle w:val="Style7"/>
-              <w:rFonts w:ascii="Book Antiqua" w:hAnsi="Book Antiqua"/>
-              <w:b w:val="0"/>
-              <w:caps w:val="0"/>
-              <w:color w:val="FF0000"/>
-              <w:sz w:val="22"/>
-              <w:szCs w:val="22"/>
-            </w:rPr>
-          </w:pPr>
-          <w:r>
-            <w:rPr>
-              <w:rFonts w:ascii="Book Antiqua" w:hAnsi="Book Antiqua"/>
-              <w:sz w:val="22"/>
-              <w:szCs w:val="22"/>
-            </w:rPr>
-            <w:t>{entidad_nombre}</w:t>
-          </w:r>
-        </w:p>
-      </w:sdtContent>
-    </w:sdt>
     <w:p>
       <w:pPr>
         <w:spacing w:after="0" w:line="240" w:lineRule="auto"/>

</xml_diff>